<commit_message>
Improve Word flyer: dark headers, correct borders and layout
Rewrote Word generation script with proper dark (#1A1A1A) section
header bars, white bold text, box borders on all sections, and layout
matching the original printed Onboard Experiences flyer.

https://claude.ai/code/session_01UaZNQccoQjy5rKpnq1SGQh
</commit_message>
<xml_diff>
--- a/Onboard_Experiences.docx
+++ b/Onboard_Experiences.docx
@@ -10,25 +10,38 @@
         <w:tblLook w:firstColumn="1" w:firstRow="1" w:lastColumn="0" w:lastRow="0" w:noHBand="0" w:noVBand="1" w:val="04A0"/>
       </w:tblPr>
       <w:tblGrid>
-        <w:gridCol w:w="4608"/>
-        <w:gridCol w:w="5472"/>
+        <w:gridCol w:w="5040"/>
+        <w:gridCol w:w="5760"/>
       </w:tblGrid>
       <w:tr>
         <w:tc>
           <w:tcPr>
-            <w:tcW w:type="dxa" w:w="5440"/>
+            <w:tcW w:type="dxa" w:w="5383"/>
+            <w:tcBorders>
+              <w:top w:val="none"/>
+              <w:bottom w:val="none"/>
+              <w:left w:val="none"/>
+              <w:right w:val="none"/>
+            </w:tcBorders>
             <w:vAlign w:val="center"/>
-            <w:tcBorders/>
+            <w:tcMar>
+              <w:top w:w="0" w:type="dxa"/>
+              <w:bottom w:w="0" w:type="dxa"/>
+              <w:left w:w="0" w:type="dxa"/>
+              <w:right w:w="80" w:type="dxa"/>
+            </w:tcMar>
           </w:tcPr>
           <w:p>
             <w:pPr>
+              <w:spacing w:before="0" w:after="0"/>
               <w:jc w:val="left"/>
             </w:pPr>
             <w:r>
               <w:rPr>
                 <w:b/>
                 <w:i w:val="0"/>
-                <w:sz w:val="56"/>
+                <w:color w:val="000000"/>
+                <w:sz w:val="60"/>
                 <w:u w:val="none"/>
               </w:rPr>
               <w:t>ONBOARD</w:t>
@@ -37,10 +50,15 @@
             </w:r>
           </w:p>
           <w:p>
+            <w:pPr>
+              <w:spacing w:before="0" w:after="0"/>
+              <w:jc w:val="left"/>
+            </w:pPr>
             <w:r>
               <w:rPr>
                 <w:b/>
                 <w:i w:val="0"/>
+                <w:color w:val="000000"/>
                 <w:sz w:val="22"/>
                 <w:u w:val="none"/>
               </w:rPr>
@@ -48,10 +66,15 @@
             </w:r>
           </w:p>
           <w:p>
+            <w:pPr>
+              <w:spacing w:before="0" w:after="0"/>
+              <w:jc w:val="left"/>
+            </w:pPr>
             <w:r>
               <w:rPr>
                 <w:b/>
                 <w:i w:val="0"/>
+                <w:color w:val="000000"/>
                 <w:sz w:val="16"/>
                 <w:u w:val="none"/>
               </w:rPr>
@@ -61,8 +84,20 @@
         </w:tc>
         <w:tc>
           <w:tcPr>
-            <w:tcW w:type="dxa" w:w="5440"/>
-            <w:tcBorders/>
+            <w:tcW w:type="dxa" w:w="5383"/>
+            <w:tcBorders>
+              <w:top w:val="none"/>
+              <w:bottom w:val="none"/>
+              <w:left w:val="none"/>
+              <w:right w:val="none"/>
+            </w:tcBorders>
+            <w:vAlign w:val="top"/>
+            <w:tcMar>
+              <w:top w:w="0" w:type="dxa"/>
+              <w:bottom w:w="0" w:type="dxa"/>
+              <w:left w:w="80" w:type="dxa"/>
+              <w:right w:w="0" w:type="dxa"/>
+            </w:tcMar>
           </w:tcPr>
           <w:p/>
           <w:tbl>
@@ -72,38 +107,237 @@
               <w:tblLook w:firstColumn="1" w:firstRow="1" w:lastColumn="0" w:lastRow="0" w:noHBand="0" w:noVBand="1" w:val="04A0"/>
             </w:tblPr>
             <w:tblGrid>
-              <w:gridCol w:w="5440"/>
+              <w:gridCol w:w="5383"/>
             </w:tblGrid>
             <w:tr>
               <w:tc>
                 <w:tcPr>
-                  <w:tcW w:type="dxa" w:w="5440"/>
+                  <w:tcW w:type="dxa" w:w="5383"/>
+                  <w:vMerge w:val="restart"/>
                   <w:tcBorders>
-                    <w:top w:val="single" w:sz="6" w:space="0" w:color="000000"/>
-                    <w:left w:val="single" w:sz="6" w:space="0" w:color="000000"/>
-                    <w:bottom w:val="single" w:sz="6" w:space="0" w:color="000000"/>
-                    <w:right w:val="single" w:sz="6" w:space="0" w:color="000000"/>
+                    <w:top w:val="single" w:sz="8" w:space="0" w:color="222222"/>
+                    <w:bottom w:val="single" w:sz="8" w:space="0" w:color="222222"/>
+                    <w:left w:val="single" w:sz="8" w:space="0" w:color="222222"/>
+                    <w:right w:val="single" w:sz="8" w:space="0" w:color="222222"/>
                   </w:tcBorders>
+                  <w:tcMar>
+                    <w:top w:w="60" w:type="dxa"/>
+                    <w:bottom w:w="60" w:type="dxa"/>
+                    <w:left w:w="100" w:type="dxa"/>
+                    <w:right w:w="100" w:type="dxa"/>
+                  </w:tcMar>
                 </w:tcPr>
                 <w:p>
                   <w:pPr>
+                    <w:spacing w:before="0" w:after="0"/>
                     <w:jc w:val="left"/>
                   </w:pPr>
                   <w:r>
                     <w:rPr>
                       <w:b/>
                       <w:i w:val="0"/>
+                      <w:color w:val="000000"/>
                       <w:sz w:val="16"/>
                       <w:u w:val="none"/>
                     </w:rPr>
                     <w:t>GUEST NAME:</w:t>
                   </w:r>
                 </w:p>
+                <w:p>
+                  <w:pPr>
+                    <w:spacing w:before="0" w:after="0"/>
+                  </w:pPr>
+                </w:p>
+              </w:tc>
+            </w:tr>
+            <w:tr>
+              <w:tc>
+                <w:tcPr>
+                  <w:tcW w:type="dxa" w:w="5383"/>
+                  <w:vMerge/>
+                </w:tcPr>
                 <w:p/>
               </w:tc>
             </w:tr>
           </w:tbl>
           <w:p/>
+          <w:p>
+            <w:pPr>
+              <w:spacing w:before="0" w:after="80"/>
+            </w:pPr>
+          </w:p>
+          <w:tbl>
+            <w:tblPr>
+              <w:tblStyle w:val="TableGrid"/>
+              <w:tblW w:type="auto" w:w="0"/>
+              <w:tblLook w:firstColumn="1" w:firstRow="1" w:lastColumn="0" w:lastRow="0" w:noHBand="0" w:noVBand="1" w:val="04A0"/>
+            </w:tblPr>
+            <w:tblGrid>
+              <w:gridCol w:w="5383"/>
+            </w:tblGrid>
+            <w:tr>
+              <w:tc>
+                <w:tcPr>
+                  <w:tcW w:type="dxa" w:w="5383"/>
+                  <w:vMerge w:val="restart"/>
+                  <w:tcBorders>
+                    <w:top w:val="single" w:sz="8" w:space="0" w:color="222222"/>
+                    <w:bottom w:val="single" w:sz="8" w:space="0" w:color="222222"/>
+                    <w:left w:val="single" w:sz="8" w:space="0" w:color="222222"/>
+                    <w:right w:val="single" w:sz="8" w:space="0" w:color="222222"/>
+                  </w:tcBorders>
+                  <w:tcMar>
+                    <w:top w:w="60" w:type="dxa"/>
+                    <w:bottom w:w="60" w:type="dxa"/>
+                    <w:left w:w="100" w:type="dxa"/>
+                    <w:right w:w="100" w:type="dxa"/>
+                  </w:tcMar>
+                </w:tcPr>
+                <w:p>
+                  <w:pPr>
+                    <w:spacing w:before="0" w:after="0"/>
+                    <w:jc w:val="left"/>
+                  </w:pPr>
+                  <w:r>
+                    <w:rPr>
+                      <w:b/>
+                      <w:i w:val="0"/>
+                      <w:color w:val="000000"/>
+                      <w:sz w:val="16"/>
+                      <w:u w:val="none"/>
+                    </w:rPr>
+                    <w:t>ROOM NUMBER:</w:t>
+                  </w:r>
+                </w:p>
+                <w:p>
+                  <w:pPr>
+                    <w:spacing w:before="0" w:after="0"/>
+                  </w:pPr>
+                </w:p>
+              </w:tc>
+            </w:tr>
+            <w:tr>
+              <w:tc>
+                <w:tcPr>
+                  <w:tcW w:type="dxa" w:w="5383"/>
+                  <w:vMerge/>
+                </w:tcPr>
+                <w:p/>
+              </w:tc>
+            </w:tr>
+          </w:tbl>
+          <w:p/>
+          <w:p>
+            <w:pPr>
+              <w:spacing w:before="0" w:after="80"/>
+            </w:pPr>
+          </w:p>
+          <w:tbl>
+            <w:tblPr>
+              <w:tblStyle w:val="TableGrid"/>
+              <w:tblW w:type="auto" w:w="0"/>
+              <w:tblLook w:firstColumn="1" w:firstRow="1" w:lastColumn="0" w:lastRow="0" w:noHBand="0" w:noVBand="1" w:val="04A0"/>
+            </w:tblPr>
+            <w:tblGrid>
+              <w:gridCol w:w="5383"/>
+            </w:tblGrid>
+            <w:tr>
+              <w:tc>
+                <w:tcPr>
+                  <w:tcW w:type="dxa" w:w="5383"/>
+                  <w:vMerge w:val="restart"/>
+                  <w:tcBorders>
+                    <w:top w:val="single" w:sz="8" w:space="0" w:color="222222"/>
+                    <w:bottom w:val="single" w:sz="8" w:space="0" w:color="222222"/>
+                    <w:left w:val="single" w:sz="8" w:space="0" w:color="222222"/>
+                    <w:right w:val="single" w:sz="8" w:space="0" w:color="222222"/>
+                  </w:tcBorders>
+                  <w:tcMar>
+                    <w:top w:w="60" w:type="dxa"/>
+                    <w:bottom w:w="60" w:type="dxa"/>
+                    <w:left w:w="100" w:type="dxa"/>
+                    <w:right w:w="100" w:type="dxa"/>
+                  </w:tcMar>
+                </w:tcPr>
+                <w:p>
+                  <w:pPr>
+                    <w:spacing w:before="0" w:after="0"/>
+                    <w:jc w:val="left"/>
+                  </w:pPr>
+                  <w:r>
+                    <w:rPr>
+                      <w:b/>
+                      <w:i w:val="0"/>
+                      <w:color w:val="000000"/>
+                      <w:sz w:val="16"/>
+                      <w:u w:val="none"/>
+                    </w:rPr>
+                    <w:t>CREWMEMBER'S NAME &amp; MAPS ID:</w:t>
+                  </w:r>
+                </w:p>
+                <w:p>
+                  <w:pPr>
+                    <w:spacing w:before="0" w:after="0"/>
+                  </w:pPr>
+                </w:p>
+              </w:tc>
+            </w:tr>
+            <w:tr>
+              <w:tc>
+                <w:tcPr>
+                  <w:tcW w:type="dxa" w:w="5383"/>
+                  <w:vMerge/>
+                </w:tcPr>
+                <w:p/>
+              </w:tc>
+            </w:tr>
+          </w:tbl>
+          <w:p/>
+          <w:p>
+            <w:pPr>
+              <w:spacing w:before="0" w:after="80"/>
+            </w:pPr>
+          </w:p>
+        </w:tc>
+      </w:tr>
+    </w:tbl>
+    <w:p>
+      <w:pPr>
+        <w:spacing w:before="120" w:after="0"/>
+      </w:pPr>
+    </w:p>
+    <w:tbl>
+      <w:tblPr>
+        <w:tblStyle w:val="TableGrid"/>
+        <w:tblW w:type="auto" w:w="0"/>
+        <w:jc w:val="center"/>
+        <w:tblLook w:firstColumn="1" w:firstRow="1" w:lastColumn="0" w:lastRow="0" w:noHBand="0" w:noVBand="1" w:val="04A0"/>
+      </w:tblPr>
+      <w:tblGrid>
+        <w:gridCol w:w="3589"/>
+        <w:gridCol w:w="3589"/>
+        <w:gridCol w:w="3589"/>
+      </w:tblGrid>
+      <w:tr>
+        <w:tc>
+          <w:tcPr>
+            <w:tcW w:type="dxa" w:w="3600"/>
+            <w:vMerge w:val="restart"/>
+            <w:tcBorders>
+              <w:top w:val="single" w:sz="12" w:space="0" w:color="222222"/>
+              <w:bottom w:val="single" w:sz="12" w:space="0" w:color="222222"/>
+              <w:left w:val="single" w:sz="12" w:space="0" w:color="222222"/>
+              <w:right w:val="single" w:sz="12" w:space="0" w:color="222222"/>
+            </w:tcBorders>
+            <w:shd w:val="clear" w:color="auto" w:fill="FFFFFF"/>
+            <w:vAlign w:val="top"/>
+            <w:tcMar>
+              <w:top w:w="0" w:type="dxa"/>
+              <w:bottom w:w="80" w:type="dxa"/>
+              <w:left w:w="0" w:type="dxa"/>
+              <w:right w:w="0" w:type="dxa"/>
+            </w:tcMar>
+          </w:tcPr>
           <w:p/>
           <w:tbl>
             <w:tblPr>
@@ -112,140 +346,29 @@
               <w:tblLook w:firstColumn="1" w:firstRow="1" w:lastColumn="0" w:lastRow="0" w:noHBand="0" w:noVBand="1" w:val="04A0"/>
             </w:tblPr>
             <w:tblGrid>
-              <w:gridCol w:w="5440"/>
+              <w:gridCol w:w="3600"/>
             </w:tblGrid>
             <w:tr>
               <w:tc>
                 <w:tcPr>
-                  <w:tcW w:type="dxa" w:w="5440"/>
+                  <w:tcW w:type="dxa" w:w="3600"/>
+                  <w:shd w:val="clear" w:color="auto" w:fill="1A1A1A"/>
                   <w:tcBorders>
-                    <w:top w:val="single" w:sz="6" w:space="0" w:color="000000"/>
-                    <w:left w:val="single" w:sz="6" w:space="0" w:color="000000"/>
-                    <w:bottom w:val="single" w:sz="6" w:space="0" w:color="000000"/>
-                    <w:right w:val="single" w:sz="6" w:space="0" w:color="000000"/>
+                    <w:top w:val="single" w:sz="8" w:space="0" w:color="1A1A1A"/>
+                    <w:bottom w:val="single" w:sz="8" w:space="0" w:color="1A1A1A"/>
+                    <w:left w:val="single" w:sz="8" w:space="0" w:color="1A1A1A"/>
+                    <w:right w:val="single" w:sz="8" w:space="0" w:color="1A1A1A"/>
                   </w:tcBorders>
+                  <w:tcMar>
+                    <w:top w:w="60" w:type="dxa"/>
+                    <w:bottom w:w="60" w:type="dxa"/>
+                    <w:left w:w="80" w:type="dxa"/>
+                    <w:right w:w="80" w:type="dxa"/>
+                  </w:tcMar>
                 </w:tcPr>
                 <w:p>
                   <w:pPr>
-                    <w:jc w:val="left"/>
-                  </w:pPr>
-                  <w:r>
-                    <w:rPr>
-                      <w:b/>
-                      <w:i w:val="0"/>
-                      <w:sz w:val="16"/>
-                      <w:u w:val="none"/>
-                    </w:rPr>
-                    <w:t>ROOM NUMBER:</w:t>
-                  </w:r>
-                </w:p>
-                <w:p/>
-              </w:tc>
-            </w:tr>
-          </w:tbl>
-          <w:p/>
-          <w:p/>
-          <w:tbl>
-            <w:tblPr>
-              <w:tblStyle w:val="TableGrid"/>
-              <w:tblW w:type="auto" w:w="0"/>
-              <w:tblLook w:firstColumn="1" w:firstRow="1" w:lastColumn="0" w:lastRow="0" w:noHBand="0" w:noVBand="1" w:val="04A0"/>
-            </w:tblPr>
-            <w:tblGrid>
-              <w:gridCol w:w="5440"/>
-            </w:tblGrid>
-            <w:tr>
-              <w:tc>
-                <w:tcPr>
-                  <w:tcW w:type="dxa" w:w="5440"/>
-                  <w:tcBorders>
-                    <w:top w:val="single" w:sz="6" w:space="0" w:color="000000"/>
-                    <w:left w:val="single" w:sz="6" w:space="0" w:color="000000"/>
-                    <w:bottom w:val="single" w:sz="6" w:space="0" w:color="000000"/>
-                    <w:right w:val="single" w:sz="6" w:space="0" w:color="000000"/>
-                  </w:tcBorders>
-                </w:tcPr>
-                <w:p>
-                  <w:pPr>
-                    <w:jc w:val="left"/>
-                  </w:pPr>
-                  <w:r>
-                    <w:rPr>
-                      <w:b/>
-                      <w:i w:val="0"/>
-                      <w:sz w:val="16"/>
-                      <w:u w:val="none"/>
-                    </w:rPr>
-                    <w:t>CREWMEMBER'S NAME &amp; MAPS ID:</w:t>
-                  </w:r>
-                </w:p>
-                <w:p/>
-              </w:tc>
-            </w:tr>
-          </w:tbl>
-          <w:p/>
-          <w:p/>
-        </w:tc>
-      </w:tr>
-    </w:tbl>
-    <w:p/>
-    <w:tbl>
-      <w:tblPr>
-        <w:tblStyle w:val="TableGrid"/>
-        <w:tblW w:type="auto" w:w="0"/>
-        <w:jc w:val="center"/>
-        <w:tblLook w:firstColumn="1" w:firstRow="1" w:lastColumn="0" w:lastRow="0" w:noHBand="0" w:noVBand="1" w:val="04A0"/>
-      </w:tblPr>
-      <w:tblGrid>
-        <w:gridCol w:w="3627"/>
-        <w:gridCol w:w="3627"/>
-        <w:gridCol w:w="3627"/>
-      </w:tblGrid>
-      <w:tr>
-        <w:tc>
-          <w:tcPr>
-            <w:tcW w:type="dxa" w:w="3168"/>
-            <w:vMerge w:val="restart"/>
-            <w:tcBorders>
-              <w:top w:val="single" w:sz="12" w:space="0" w:color="000000"/>
-              <w:left w:val="single" w:sz="12" w:space="0" w:color="000000"/>
-              <w:bottom w:val="single" w:sz="12" w:space="0" w:color="000000"/>
-              <w:right w:val="single" w:sz="12" w:space="0" w:color="000000"/>
-            </w:tcBorders>
-            <w:shd w:val="clear" w:color="auto" w:fill="FFFFFF"/>
-            <w:vAlign w:val="top"/>
-            <w:shd w:val="clear" w:color="auto" w:fill="333333"/>
-            <w:shd w:val="clear" w:color="auto" w:fill="FFFFFF"/>
-            <w:tcBorders>
-              <w:top w:val="single" w:sz="12" w:space="0" w:color="000000"/>
-              <w:left w:val="single" w:sz="12" w:space="0" w:color="000000"/>
-              <w:bottom w:val="single" w:sz="12" w:space="0" w:color="000000"/>
-              <w:right w:val="single" w:sz="12" w:space="0" w:color="000000"/>
-            </w:tcBorders>
-          </w:tcPr>
-          <w:tbl>
-            <w:tblPr>
-              <w:tblStyle w:val="TableGrid"/>
-              <w:tblW w:type="auto" w:w="0"/>
-              <w:tblLook w:firstColumn="1" w:firstRow="1" w:lastColumn="0" w:lastRow="0" w:noHBand="0" w:noVBand="1" w:val="04A0"/>
-            </w:tblPr>
-            <w:tblGrid>
-              <w:gridCol w:w="3168"/>
-            </w:tblGrid>
-            <w:tr>
-              <w:tc>
-                <w:tcPr>
-                  <w:tcW w:type="dxa" w:w="3168"/>
-                  <w:shd w:val="clear" w:color="auto" w:fill="333333"/>
-                  <w:tcBorders>
-                    <w:top w:val="single" w:sz="12" w:space="0" w:color="333333"/>
-                    <w:left w:val="single" w:sz="12" w:space="0" w:color="333333"/>
-                    <w:bottom w:val="single" w:sz="12" w:space="0" w:color="333333"/>
-                    <w:right w:val="single" w:sz="12" w:space="0" w:color="333333"/>
-                  </w:tcBorders>
-                </w:tcPr>
-                <w:p>
-                  <w:pPr>
+                    <w:spacing w:before="0" w:after="0"/>
                     <w:jc w:val="center"/>
                   </w:pPr>
                   <w:r>
@@ -265,12 +388,14 @@
           <w:p/>
           <w:p>
             <w:pPr>
+              <w:spacing w:before="0" w:after="0"/>
               <w:jc w:val="center"/>
             </w:pPr>
             <w:r>
               <w:rPr>
                 <w:b w:val="0"/>
                 <w:i w:val="0"/>
+                <w:color w:val="000000"/>
                 <w:sz w:val="18"/>
                 <w:u w:val="single"/>
               </w:rPr>
@@ -279,26 +404,46 @@
           </w:p>
           <w:p>
             <w:pPr>
+              <w:spacing w:before="0" w:after="0"/>
               <w:jc w:val="center"/>
             </w:pPr>
             <w:r>
               <w:rPr>
                 <w:b w:val="0"/>
                 <w:i w:val="0"/>
+                <w:color w:val="000000"/>
                 <w:sz w:val="16"/>
                 <w:u w:val="none"/>
               </w:rPr>
-              <w:t>BOKA BAY CATAMARAN SAIL &amp; BEACH</w:t>
+              <w:t>BOKA BAY CATAMARAN SAIL &amp;</w:t>
             </w:r>
           </w:p>
           <w:p>
             <w:pPr>
+              <w:spacing w:before="0" w:after="0"/>
+              <w:jc w:val="center"/>
+            </w:pPr>
+            <w:r>
+              <w:rPr>
+                <w:b w:val="0"/>
+                <w:i w:val="0"/>
+                <w:color w:val="000000"/>
+                <w:sz w:val="16"/>
+                <w:u w:val="none"/>
+              </w:rPr>
+              <w:t>BEACH</w:t>
+            </w:r>
+          </w:p>
+          <w:p>
+            <w:pPr>
+              <w:spacing w:before="0" w:after="0"/>
               <w:jc w:val="center"/>
             </w:pPr>
             <w:r>
               <w:rPr>
                 <w:b/>
                 <w:i w:val="0"/>
+                <w:color w:val="000000"/>
                 <w:sz w:val="16"/>
                 <w:u w:val="none"/>
               </w:rPr>
@@ -307,12 +452,14 @@
           </w:p>
           <w:p>
             <w:pPr>
+              <w:spacing w:before="0" w:after="0"/>
               <w:jc w:val="center"/>
             </w:pPr>
             <w:r>
               <w:rPr>
                 <w:b w:val="0"/>
                 <w:i w:val="0"/>
+                <w:color w:val="000000"/>
                 <w:sz w:val="16"/>
                 <w:u w:val="none"/>
               </w:rPr>
@@ -321,12 +468,14 @@
           </w:p>
           <w:p>
             <w:pPr>
+              <w:spacing w:before="0" w:after="0"/>
               <w:jc w:val="center"/>
             </w:pPr>
             <w:r>
               <w:rPr>
                 <w:b/>
                 <w:i w:val="0"/>
+                <w:color w:val="000000"/>
                 <w:sz w:val="16"/>
                 <w:u w:val="none"/>
               </w:rPr>
@@ -335,12 +484,14 @@
           </w:p>
           <w:p>
             <w:pPr>
+              <w:spacing w:before="0" w:after="0"/>
               <w:jc w:val="center"/>
             </w:pPr>
             <w:r>
               <w:rPr>
                 <w:b w:val="0"/>
                 <w:i w:val="0"/>
+                <w:color w:val="000000"/>
                 <w:sz w:val="18"/>
                 <w:u w:val="single"/>
               </w:rPr>
@@ -349,12 +500,14 @@
           </w:p>
           <w:p>
             <w:pPr>
+              <w:spacing w:before="0" w:after="0"/>
               <w:jc w:val="center"/>
             </w:pPr>
             <w:r>
               <w:rPr>
                 <w:b w:val="0"/>
                 <w:i w:val="0"/>
+                <w:color w:val="000000"/>
                 <w:sz w:val="16"/>
                 <w:u w:val="none"/>
               </w:rPr>
@@ -363,12 +516,14 @@
           </w:p>
           <w:p>
             <w:pPr>
+              <w:spacing w:before="0" w:after="0"/>
               <w:jc w:val="center"/>
             </w:pPr>
             <w:r>
               <w:rPr>
                 <w:b/>
                 <w:i w:val="0"/>
+                <w:color w:val="000000"/>
                 <w:sz w:val="16"/>
                 <w:u w:val="none"/>
               </w:rPr>
@@ -377,28 +532,46 @@
           </w:p>
           <w:p>
             <w:pPr>
+              <w:spacing w:before="0" w:after="0"/>
               <w:jc w:val="center"/>
             </w:pPr>
             <w:r>
               <w:rPr>
                 <w:b w:val="0"/>
                 <w:i w:val="0"/>
+                <w:color w:val="000000"/>
                 <w:sz w:val="16"/>
                 <w:u w:val="none"/>
               </w:rPr>
               <w:t>SPLIT OPEN-AIR SIGHTSEEING</w:t>
-              <w:br/>
+            </w:r>
+          </w:p>
+          <w:p>
+            <w:pPr>
+              <w:spacing w:before="0" w:after="0"/>
+              <w:jc w:val="center"/>
+            </w:pPr>
+            <w:r>
+              <w:rPr>
+                <w:b w:val="0"/>
+                <w:i w:val="0"/>
+                <w:color w:val="000000"/>
+                <w:sz w:val="16"/>
+                <w:u w:val="none"/>
+              </w:rPr>
               <w:t>&amp; WALKING TOUR</w:t>
             </w:r>
           </w:p>
           <w:p>
             <w:pPr>
+              <w:spacing w:before="0" w:after="0"/>
               <w:jc w:val="center"/>
             </w:pPr>
             <w:r>
               <w:rPr>
                 <w:b/>
                 <w:i w:val="0"/>
+                <w:color w:val="000000"/>
                 <w:sz w:val="16"/>
                 <w:u w:val="none"/>
               </w:rPr>
@@ -407,39 +580,66 @@
           </w:p>
           <w:p>
             <w:pPr>
+              <w:spacing w:before="0" w:after="0"/>
               <w:jc w:val="center"/>
             </w:pPr>
             <w:r>
               <w:rPr>
                 <w:b w:val="0"/>
                 <w:i/>
+                <w:color w:val="000000"/>
                 <w:sz w:val="16"/>
                 <w:u w:val="none"/>
               </w:rPr>
               <w:t>Visit Shore Excursions Desk</w:t>
-              <w:br/>
+            </w:r>
+          </w:p>
+          <w:p>
+            <w:pPr>
+              <w:spacing w:before="0" w:after="0"/>
+              <w:jc w:val="center"/>
+            </w:pPr>
+            <w:r>
+              <w:rPr>
+                <w:b w:val="0"/>
+                <w:i/>
+                <w:color w:val="000000"/>
+                <w:sz w:val="16"/>
+                <w:u w:val="none"/>
+              </w:rPr>
               <w:t>Deck 7, Mid</w:t>
             </w:r>
           </w:p>
         </w:tc>
         <w:tc>
           <w:tcPr>
-            <w:tcW w:type="dxa" w:w="72"/>
-            <w:tcBorders/>
+            <w:tcW w:type="dxa" w:w="173"/>
+            <w:tcBorders>
+              <w:top w:val="none"/>
+              <w:bottom w:val="none"/>
+              <w:left w:val="none"/>
+              <w:right w:val="none"/>
+            </w:tcBorders>
           </w:tcPr>
           <w:p/>
         </w:tc>
         <w:tc>
           <w:tcPr>
-            <w:tcW w:type="dxa" w:w="6840"/>
+            <w:tcW w:type="dxa" w:w="7027"/>
             <w:tcBorders>
-              <w:top w:val="single" w:sz="12" w:space="0" w:color="000000"/>
-              <w:left w:val="single" w:sz="12" w:space="0" w:color="000000"/>
-              <w:bottom w:val="single" w:sz="12" w:space="0" w:color="000000"/>
-              <w:right w:val="single" w:sz="12" w:space="0" w:color="000000"/>
+              <w:top w:val="single" w:sz="12" w:space="0" w:color="222222"/>
+              <w:bottom w:val="single" w:sz="12" w:space="0" w:color="222222"/>
+              <w:left w:val="single" w:sz="12" w:space="0" w:color="222222"/>
+              <w:right w:val="single" w:sz="12" w:space="0" w:color="222222"/>
             </w:tcBorders>
             <w:shd w:val="clear" w:color="auto" w:fill="FFFFFF"/>
             <w:vAlign w:val="top"/>
+            <w:tcMar>
+              <w:top w:w="0" w:type="dxa"/>
+              <w:bottom w:w="80" w:type="dxa"/>
+              <w:left w:w="0" w:type="dxa"/>
+              <w:right w:w="0" w:type="dxa"/>
+            </w:tcMar>
           </w:tcPr>
           <w:p/>
           <w:tbl>
@@ -449,22 +649,29 @@
               <w:tblLook w:firstColumn="1" w:firstRow="1" w:lastColumn="0" w:lastRow="0" w:noHBand="0" w:noVBand="1" w:val="04A0"/>
             </w:tblPr>
             <w:tblGrid>
-              <w:gridCol w:w="6840"/>
+              <w:gridCol w:w="7027"/>
             </w:tblGrid>
             <w:tr>
               <w:tc>
                 <w:tcPr>
-                  <w:tcW w:type="dxa" w:w="6840"/>
-                  <w:shd w:val="clear" w:color="auto" w:fill="333333"/>
+                  <w:tcW w:type="dxa" w:w="7027"/>
+                  <w:shd w:val="clear" w:color="auto" w:fill="1A1A1A"/>
                   <w:tcBorders>
-                    <w:top w:val="single" w:sz="12" w:space="0" w:color="333333"/>
-                    <w:left w:val="single" w:sz="12" w:space="0" w:color="333333"/>
-                    <w:bottom w:val="single" w:sz="12" w:space="0" w:color="333333"/>
-                    <w:right w:val="single" w:sz="12" w:space="0" w:color="333333"/>
+                    <w:top w:val="single" w:sz="8" w:space="0" w:color="1A1A1A"/>
+                    <w:bottom w:val="single" w:sz="8" w:space="0" w:color="1A1A1A"/>
+                    <w:left w:val="single" w:sz="8" w:space="0" w:color="1A1A1A"/>
+                    <w:right w:val="single" w:sz="8" w:space="0" w:color="1A1A1A"/>
                   </w:tcBorders>
+                  <w:tcMar>
+                    <w:top w:w="60" w:type="dxa"/>
+                    <w:bottom w:w="60" w:type="dxa"/>
+                    <w:left w:w="80" w:type="dxa"/>
+                    <w:right w:w="80" w:type="dxa"/>
+                  </w:tcMar>
                 </w:tcPr>
                 <w:p>
                   <w:pPr>
+                    <w:spacing w:before="0" w:after="0"/>
                     <w:jc w:val="center"/>
                   </w:pPr>
                   <w:r>
@@ -484,12 +691,14 @@
           <w:p/>
           <w:p>
             <w:pPr>
+              <w:spacing w:before="0" w:after="0"/>
               <w:jc w:val="center"/>
             </w:pPr>
             <w:r>
               <w:rPr>
                 <w:b w:val="0"/>
                 <w:i w:val="0"/>
+                <w:color w:val="000000"/>
                 <w:sz w:val="16"/>
                 <w:u w:val="none"/>
               </w:rPr>
@@ -498,30 +707,62 @@
           </w:p>
           <w:p>
             <w:pPr>
+              <w:spacing w:before="0" w:after="0"/>
               <w:jc w:val="center"/>
             </w:pPr>
             <w:r>
               <w:rPr>
                 <w:b w:val="0"/>
                 <w:i w:val="0"/>
+                <w:color w:val="000000"/>
                 <w:sz w:val="16"/>
                 <w:u w:val="none"/>
               </w:rPr>
               <w:t>Unwind in style with an exclusive, adults-only retreat</w:t>
-              <w:br/>
-              <w:t>with ocean views &amp; enjoy premium touches designed</w:t>
-              <w:br/>
-              <w:t>just for you.</w:t>
             </w:r>
           </w:p>
           <w:p>
             <w:pPr>
+              <w:spacing w:before="0" w:after="0"/>
               <w:jc w:val="center"/>
             </w:pPr>
             <w:r>
               <w:rPr>
                 <w:b w:val="0"/>
                 <w:i w:val="0"/>
+                <w:color w:val="000000"/>
+                <w:sz w:val="16"/>
+                <w:u w:val="none"/>
+              </w:rPr>
+              <w:t>with ocean views &amp; enjoy premium touches designed</w:t>
+            </w:r>
+          </w:p>
+          <w:p>
+            <w:pPr>
+              <w:spacing w:before="0" w:after="0"/>
+              <w:jc w:val="center"/>
+            </w:pPr>
+            <w:r>
+              <w:rPr>
+                <w:b w:val="0"/>
+                <w:i w:val="0"/>
+                <w:color w:val="000000"/>
+                <w:sz w:val="16"/>
+                <w:u w:val="none"/>
+              </w:rPr>
+              <w:t>just for you.</w:t>
+            </w:r>
+          </w:p>
+          <w:p>
+            <w:pPr>
+              <w:spacing w:before="0" w:after="0"/>
+              <w:jc w:val="center"/>
+            </w:pPr>
+            <w:r>
+              <w:rPr>
+                <w:b w:val="0"/>
+                <w:i w:val="0"/>
+                <w:color w:val="000000"/>
                 <w:sz w:val="16"/>
                 <w:u w:val="none"/>
               </w:rPr>
@@ -530,12 +771,14 @@
           </w:p>
           <w:p>
             <w:pPr>
+              <w:spacing w:before="0" w:after="0"/>
               <w:jc w:val="center"/>
             </w:pPr>
             <w:r>
               <w:rPr>
                 <w:b w:val="0"/>
                 <w:i w:val="0"/>
+                <w:color w:val="000000"/>
                 <w:sz w:val="16"/>
                 <w:u w:val="none"/>
               </w:rPr>
@@ -544,53 +787,46 @@
           </w:p>
           <w:p>
             <w:pPr>
+              <w:spacing w:before="0" w:after="0"/>
               <w:jc w:val="center"/>
             </w:pPr>
             <w:r>
               <w:rPr>
                 <w:b/>
                 <w:i w:val="0"/>
-                <w:sz w:val="16"/>
+                <w:color w:val="000000"/>
+                <w:sz w:val="18"/>
                 <w:u w:val="none"/>
               </w:rPr>
-              <w:t>Vibe Cruise Pass - $209/person (4 days)</w:t>
+              <w:t>Vibe Cruise Pass – $209/person (4 days)</w:t>
             </w:r>
           </w:p>
           <w:p>
             <w:pPr>
+              <w:spacing w:before="0" w:after="0"/>
               <w:jc w:val="center"/>
             </w:pPr>
             <w:r>
               <w:rPr>
                 <w:b/>
                 <w:i w:val="0"/>
-                <w:sz w:val="16"/>
+                <w:color w:val="000000"/>
+                <w:sz w:val="18"/>
                 <w:u w:val="none"/>
               </w:rPr>
-              <w:t>Vibe Cabanas - $499/2pax (4 days)</w:t>
+              <w:t>Vibe Cabanas – $499/2pax (4 days)</w:t>
             </w:r>
           </w:p>
           <w:p>
             <w:pPr>
-              <w:jc w:val="center"/>
-            </w:pPr>
-            <w:r>
-              <w:rPr>
-                <w:b w:val="0"/>
-                <w:i w:val="0"/>
-                <w:sz w:val="16"/>
-                <w:u w:val="none"/>
-              </w:rPr>
-            </w:r>
-          </w:p>
-          <w:p>
-            <w:pPr>
+              <w:spacing w:before="0" w:after="0"/>
               <w:jc w:val="center"/>
             </w:pPr>
             <w:r>
               <w:rPr>
                 <w:b w:val="0"/>
                 <w:i/>
+                <w:color w:val="000000"/>
                 <w:sz w:val="16"/>
                 <w:u w:val="none"/>
               </w:rPr>
@@ -602,29 +838,40 @@
       <w:tr>
         <w:tc>
           <w:tcPr>
-            <w:tcW w:type="dxa" w:w="3168"/>
+            <w:tcW w:type="dxa" w:w="3600"/>
             <w:vMerge/>
           </w:tcPr>
           <w:p/>
         </w:tc>
         <w:tc>
           <w:tcPr>
-            <w:tcW w:type="dxa" w:w="72"/>
-            <w:tcBorders/>
+            <w:tcW w:type="dxa" w:w="173"/>
+            <w:tcBorders>
+              <w:top w:val="none"/>
+              <w:bottom w:val="none"/>
+              <w:left w:val="none"/>
+              <w:right w:val="none"/>
+            </w:tcBorders>
           </w:tcPr>
           <w:p/>
         </w:tc>
         <w:tc>
           <w:tcPr>
-            <w:tcW w:type="dxa" w:w="6840"/>
+            <w:tcW w:type="dxa" w:w="7027"/>
             <w:tcBorders>
-              <w:top w:val="single" w:sz="12" w:space="0" w:color="000000"/>
-              <w:left w:val="single" w:sz="12" w:space="0" w:color="000000"/>
-              <w:bottom w:val="single" w:sz="12" w:space="0" w:color="000000"/>
-              <w:right w:val="single" w:sz="12" w:space="0" w:color="000000"/>
+              <w:top w:val="single" w:sz="12" w:space="0" w:color="222222"/>
+              <w:bottom w:val="single" w:sz="12" w:space="0" w:color="222222"/>
+              <w:left w:val="single" w:sz="12" w:space="0" w:color="222222"/>
+              <w:right w:val="single" w:sz="12" w:space="0" w:color="222222"/>
             </w:tcBorders>
             <w:shd w:val="clear" w:color="auto" w:fill="FFFFFF"/>
             <w:vAlign w:val="top"/>
+            <w:tcMar>
+              <w:top w:w="0" w:type="dxa"/>
+              <w:bottom w:w="80" w:type="dxa"/>
+              <w:left w:w="0" w:type="dxa"/>
+              <w:right w:w="0" w:type="dxa"/>
+            </w:tcMar>
           </w:tcPr>
           <w:p/>
           <w:tbl>
@@ -634,22 +881,29 @@
               <w:tblLook w:firstColumn="1" w:firstRow="1" w:lastColumn="0" w:lastRow="0" w:noHBand="0" w:noVBand="1" w:val="04A0"/>
             </w:tblPr>
             <w:tblGrid>
-              <w:gridCol w:w="6840"/>
+              <w:gridCol w:w="7027"/>
             </w:tblGrid>
             <w:tr>
               <w:tc>
                 <w:tcPr>
-                  <w:tcW w:type="dxa" w:w="6840"/>
-                  <w:shd w:val="clear" w:color="auto" w:fill="333333"/>
+                  <w:tcW w:type="dxa" w:w="7027"/>
+                  <w:shd w:val="clear" w:color="auto" w:fill="1A1A1A"/>
                   <w:tcBorders>
-                    <w:top w:val="single" w:sz="12" w:space="0" w:color="333333"/>
-                    <w:left w:val="single" w:sz="12" w:space="0" w:color="333333"/>
-                    <w:bottom w:val="single" w:sz="12" w:space="0" w:color="333333"/>
-                    <w:right w:val="single" w:sz="12" w:space="0" w:color="333333"/>
+                    <w:top w:val="single" w:sz="8" w:space="0" w:color="1A1A1A"/>
+                    <w:bottom w:val="single" w:sz="8" w:space="0" w:color="1A1A1A"/>
+                    <w:left w:val="single" w:sz="8" w:space="0" w:color="1A1A1A"/>
+                    <w:right w:val="single" w:sz="8" w:space="0" w:color="1A1A1A"/>
                   </w:tcBorders>
+                  <w:tcMar>
+                    <w:top w:w="60" w:type="dxa"/>
+                    <w:bottom w:w="60" w:type="dxa"/>
+                    <w:left w:w="80" w:type="dxa"/>
+                    <w:right w:w="80" w:type="dxa"/>
+                  </w:tcMar>
                 </w:tcPr>
                 <w:p>
                   <w:pPr>
+                    <w:spacing w:before="0" w:after="0"/>
                     <w:jc w:val="center"/>
                   </w:pPr>
                   <w:r>
@@ -669,12 +923,14 @@
           <w:p/>
           <w:p>
             <w:pPr>
+              <w:spacing w:before="0" w:after="0"/>
               <w:jc w:val="center"/>
             </w:pPr>
             <w:r>
               <w:rPr>
                 <w:b w:val="0"/>
                 <w:i w:val="0"/>
+                <w:color w:val="000000"/>
                 <w:sz w:val="16"/>
                 <w:u w:val="none"/>
               </w:rPr>
@@ -683,13 +939,15 @@
           </w:p>
           <w:p>
             <w:pPr>
+              <w:spacing w:before="0" w:after="0"/>
               <w:jc w:val="center"/>
             </w:pPr>
             <w:r>
               <w:rPr>
                 <w:b/>
                 <w:i w:val="0"/>
-                <w:sz w:val="22"/>
+                <w:color w:val="000000"/>
+                <w:sz w:val="26"/>
                 <w:u w:val="none"/>
               </w:rPr>
               <w:t>for only $89/person (day pass)</w:t>
@@ -697,12 +955,14 @@
           </w:p>
           <w:p>
             <w:pPr>
+              <w:spacing w:before="0" w:after="0"/>
               <w:jc w:val="center"/>
             </w:pPr>
             <w:r>
               <w:rPr>
                 <w:b w:val="0"/>
                 <w:i/>
+                <w:color w:val="000000"/>
                 <w:sz w:val="16"/>
                 <w:u w:val="none"/>
               </w:rPr>
@@ -714,15 +974,21 @@
       <w:tr>
         <w:tc>
           <w:tcPr>
-            <w:tcW w:type="dxa" w:w="3168"/>
+            <w:tcW w:type="dxa" w:w="3600"/>
             <w:tcBorders>
-              <w:top w:val="single" w:sz="12" w:space="0" w:color="000000"/>
-              <w:left w:val="single" w:sz="12" w:space="0" w:color="000000"/>
-              <w:bottom w:val="single" w:sz="12" w:space="0" w:color="000000"/>
-              <w:right w:val="single" w:sz="12" w:space="0" w:color="000000"/>
+              <w:top w:val="single" w:sz="12" w:space="0" w:color="222222"/>
+              <w:bottom w:val="single" w:sz="12" w:space="0" w:color="222222"/>
+              <w:left w:val="single" w:sz="12" w:space="0" w:color="222222"/>
+              <w:right w:val="single" w:sz="12" w:space="0" w:color="222222"/>
             </w:tcBorders>
             <w:shd w:val="clear" w:color="auto" w:fill="FFFFFF"/>
             <w:vAlign w:val="top"/>
+            <w:tcMar>
+              <w:top w:w="0" w:type="dxa"/>
+              <w:bottom w:w="80" w:type="dxa"/>
+              <w:left w:w="0" w:type="dxa"/>
+              <w:right w:w="0" w:type="dxa"/>
+            </w:tcMar>
           </w:tcPr>
           <w:p/>
           <w:tbl>
@@ -732,22 +998,29 @@
               <w:tblLook w:firstColumn="1" w:firstRow="1" w:lastColumn="0" w:lastRow="0" w:noHBand="0" w:noVBand="1" w:val="04A0"/>
             </w:tblPr>
             <w:tblGrid>
-              <w:gridCol w:w="3168"/>
+              <w:gridCol w:w="3600"/>
             </w:tblGrid>
             <w:tr>
               <w:tc>
                 <w:tcPr>
-                  <w:tcW w:type="dxa" w:w="3168"/>
-                  <w:shd w:val="clear" w:color="auto" w:fill="333333"/>
+                  <w:tcW w:type="dxa" w:w="3600"/>
+                  <w:shd w:val="clear" w:color="auto" w:fill="1A1A1A"/>
                   <w:tcBorders>
-                    <w:top w:val="single" w:sz="12" w:space="0" w:color="333333"/>
-                    <w:left w:val="single" w:sz="12" w:space="0" w:color="333333"/>
-                    <w:bottom w:val="single" w:sz="12" w:space="0" w:color="333333"/>
-                    <w:right w:val="single" w:sz="12" w:space="0" w:color="333333"/>
+                    <w:top w:val="single" w:sz="8" w:space="0" w:color="1A1A1A"/>
+                    <w:bottom w:val="single" w:sz="8" w:space="0" w:color="1A1A1A"/>
+                    <w:left w:val="single" w:sz="8" w:space="0" w:color="1A1A1A"/>
+                    <w:right w:val="single" w:sz="8" w:space="0" w:color="1A1A1A"/>
                   </w:tcBorders>
+                  <w:tcMar>
+                    <w:top w:w="60" w:type="dxa"/>
+                    <w:bottom w:w="60" w:type="dxa"/>
+                    <w:left w:w="80" w:type="dxa"/>
+                    <w:right w:w="80" w:type="dxa"/>
+                  </w:tcMar>
                 </w:tcPr>
                 <w:p>
                   <w:pPr>
+                    <w:spacing w:before="0" w:after="0"/>
                     <w:jc w:val="center"/>
                   </w:pPr>
                   <w:r>
@@ -767,71 +1040,157 @@
           <w:p/>
           <w:p>
             <w:pPr>
+              <w:spacing w:before="0" w:after="0"/>
               <w:jc w:val="center"/>
             </w:pPr>
             <w:r>
               <w:rPr>
                 <w:b w:val="0"/>
                 <w:i w:val="0"/>
+                <w:color w:val="000000"/>
                 <w:sz w:val="16"/>
                 <w:u w:val="none"/>
               </w:rPr>
-              <w:t>From Porto di Ravenna to the following airports:</w:t>
+              <w:t>From Porto di Ravenna to the</w:t>
             </w:r>
           </w:p>
           <w:p>
             <w:pPr>
+              <w:spacing w:before="0" w:after="0"/>
               <w:jc w:val="center"/>
             </w:pPr>
             <w:r>
               <w:rPr>
                 <w:b w:val="0"/>
                 <w:i w:val="0"/>
-                <w:sz w:val="12"/>
+                <w:color w:val="000000"/>
+                <w:sz w:val="16"/>
+                <w:u w:val="none"/>
+              </w:rPr>
+              <w:t>following airports:</w:t>
+            </w:r>
+          </w:p>
+          <w:p>
+            <w:pPr>
+              <w:spacing w:before="0" w:after="0"/>
+              <w:jc w:val="center"/>
+            </w:pPr>
+            <w:r>
+              <w:rPr>
+                <w:b w:val="0"/>
+                <w:i w:val="0"/>
+                <w:color w:val="000000"/>
+                <w:sz w:val="10"/>
                 <w:u w:val="none"/>
               </w:rPr>
             </w:r>
           </w:p>
           <w:p>
             <w:pPr>
+              <w:spacing w:before="0" w:after="0"/>
               <w:jc w:val="center"/>
             </w:pPr>
             <w:r>
               <w:rPr>
                 <w:b w:val="0"/>
                 <w:i w:val="0"/>
+                <w:color w:val="000000"/>
                 <w:sz w:val="16"/>
                 <w:u w:val="none"/>
               </w:rPr>
-              <w:t>-Venice Marco Polo Airport (VCE)</w:t>
-              <w:br/>
-              <w:t>-Bologna Airport (BLQ)</w:t>
-              <w:br/>
-              <w:t>-Forli International Airport (FRL)</w:t>
+              <w:t>-Venice Marco Polo Airport</w:t>
             </w:r>
           </w:p>
           <w:p>
             <w:pPr>
+              <w:spacing w:before="0" w:after="0"/>
               <w:jc w:val="center"/>
             </w:pPr>
             <w:r>
               <w:rPr>
                 <w:b w:val="0"/>
                 <w:i w:val="0"/>
-                <w:sz w:val="12"/>
+                <w:color w:val="000000"/>
+                <w:sz w:val="16"/>
+                <w:u w:val="none"/>
+              </w:rPr>
+              <w:t>(VCE)</w:t>
+            </w:r>
+          </w:p>
+          <w:p>
+            <w:pPr>
+              <w:spacing w:before="0" w:after="0"/>
+              <w:jc w:val="center"/>
+            </w:pPr>
+            <w:r>
+              <w:rPr>
+                <w:b w:val="0"/>
+                <w:i w:val="0"/>
+                <w:color w:val="000000"/>
+                <w:sz w:val="16"/>
+                <w:u w:val="none"/>
+              </w:rPr>
+              <w:t>-Bologna Airport (BLQ)</w:t>
+            </w:r>
+          </w:p>
+          <w:p>
+            <w:pPr>
+              <w:spacing w:before="0" w:after="0"/>
+              <w:jc w:val="center"/>
+            </w:pPr>
+            <w:r>
+              <w:rPr>
+                <w:b w:val="0"/>
+                <w:i w:val="0"/>
+                <w:color w:val="000000"/>
+                <w:sz w:val="16"/>
+                <w:u w:val="none"/>
+              </w:rPr>
+              <w:t>-Forli International Airport</w:t>
+            </w:r>
+          </w:p>
+          <w:p>
+            <w:pPr>
+              <w:spacing w:before="0" w:after="0"/>
+              <w:jc w:val="center"/>
+            </w:pPr>
+            <w:r>
+              <w:rPr>
+                <w:b w:val="0"/>
+                <w:i w:val="0"/>
+                <w:color w:val="000000"/>
+                <w:sz w:val="16"/>
+                <w:u w:val="none"/>
+              </w:rPr>
+              <w:t>(FRL)</w:t>
+            </w:r>
+          </w:p>
+          <w:p>
+            <w:pPr>
+              <w:spacing w:before="0" w:after="0"/>
+              <w:jc w:val="center"/>
+            </w:pPr>
+            <w:r>
+              <w:rPr>
+                <w:b w:val="0"/>
+                <w:i w:val="0"/>
+                <w:color w:val="000000"/>
+                <w:sz w:val="10"/>
                 <w:u w:val="none"/>
               </w:rPr>
             </w:r>
           </w:p>
           <w:p>
             <w:pPr>
+              <w:spacing w:before="0" w:after="0"/>
               <w:jc w:val="center"/>
             </w:pPr>
             <w:r>
               <w:rPr>
                 <w:b/>
                 <w:i w:val="0"/>
-                <w:sz w:val="20"/>
+                <w:color w:val="000000"/>
+                <w:sz w:val="22"/>
                 <w:u w:val="none"/>
               </w:rPr>
               <w:t>for only $99.50/person</w:t>
@@ -839,12 +1198,14 @@
           </w:p>
           <w:p>
             <w:pPr>
+              <w:spacing w:before="0" w:after="0"/>
               <w:jc w:val="center"/>
             </w:pPr>
             <w:r>
               <w:rPr>
                 <w:b w:val="0"/>
                 <w:i/>
+                <w:color w:val="000000"/>
                 <w:sz w:val="16"/>
                 <w:u w:val="none"/>
               </w:rPr>
@@ -853,46 +1214,76 @@
           </w:p>
           <w:p>
             <w:pPr>
+              <w:spacing w:before="0" w:after="0"/>
               <w:jc w:val="center"/>
             </w:pPr>
             <w:r>
               <w:rPr>
                 <w:b w:val="0"/>
                 <w:i w:val="0"/>
-                <w:sz w:val="12"/>
+                <w:color w:val="000000"/>
+                <w:sz w:val="10"/>
                 <w:u w:val="none"/>
               </w:rPr>
             </w:r>
           </w:p>
           <w:p>
             <w:pPr>
+              <w:spacing w:before="0" w:after="0"/>
               <w:jc w:val="center"/>
             </w:pPr>
             <w:r>
               <w:rPr>
                 <w:b w:val="0"/>
                 <w:i/>
+                <w:color w:val="000000"/>
                 <w:sz w:val="16"/>
                 <w:u w:val="none"/>
               </w:rPr>
               <w:t>Visit Guest Services Desk,</w:t>
-              <w:br/>
+            </w:r>
+          </w:p>
+          <w:p>
+            <w:pPr>
+              <w:spacing w:before="0" w:after="0"/>
+              <w:jc w:val="center"/>
+            </w:pPr>
+            <w:r>
+              <w:rPr>
+                <w:b w:val="0"/>
+                <w:i/>
+                <w:color w:val="000000"/>
+                <w:sz w:val="16"/>
+                <w:u w:val="none"/>
+              </w:rPr>
               <w:t>Deck 7 Mid</w:t>
             </w:r>
           </w:p>
         </w:tc>
         <w:tc>
           <w:tcPr>
-            <w:tcW w:type="dxa" w:w="72"/>
-            <w:tcBorders/>
+            <w:tcW w:type="dxa" w:w="173"/>
+            <w:tcBorders>
+              <w:top w:val="none"/>
+              <w:bottom w:val="none"/>
+              <w:left w:val="none"/>
+              <w:right w:val="none"/>
+            </w:tcBorders>
           </w:tcPr>
           <w:p/>
         </w:tc>
         <w:tc>
           <w:tcPr>
-            <w:tcW w:type="dxa" w:w="6840"/>
-            <w:tcBorders/>
+            <w:tcW w:type="dxa" w:w="7027"/>
+            <w:tcBorders>
+              <w:top w:val="none"/>
+              <w:bottom w:val="none"/>
+              <w:left w:val="none"/>
+              <w:right w:val="none"/>
+            </w:tcBorders>
+            <w:shd w:val="clear" w:color="auto" w:fill="FFFFFF"/>
           </w:tcPr>
+          <w:p/>
           <w:tbl>
             <w:tblPr>
               <w:tblStyle w:val="TableGrid"/>
@@ -900,21 +1291,27 @@
               <w:tblLook w:firstColumn="1" w:firstRow="1" w:lastColumn="0" w:lastRow="0" w:noHBand="0" w:noVBand="1" w:val="04A0"/>
             </w:tblPr>
             <w:tblGrid>
-              <w:gridCol w:w="3420"/>
-              <w:gridCol w:w="3420"/>
+              <w:gridCol w:w="3456"/>
+              <w:gridCol w:w="3571"/>
             </w:tblGrid>
             <w:tr>
               <w:tc>
                 <w:tcPr>
-                  <w:tcW w:type="dxa" w:w="3420"/>
+                  <w:tcW w:type="dxa" w:w="3456"/>
                   <w:tcBorders>
-                    <w:top w:val="single" w:sz="12" w:space="0" w:color="000000"/>
-                    <w:left w:val="single" w:sz="12" w:space="0" w:color="000000"/>
-                    <w:bottom w:val="single" w:sz="12" w:space="0" w:color="000000"/>
-                    <w:right w:val="single" w:sz="12" w:space="0" w:color="000000"/>
+                    <w:top w:val="single" w:sz="12" w:space="0" w:color="222222"/>
+                    <w:bottom w:val="single" w:sz="12" w:space="0" w:color="222222"/>
+                    <w:left w:val="single" w:sz="12" w:space="0" w:color="222222"/>
+                    <w:right w:val="single" w:sz="12" w:space="0" w:color="222222"/>
                   </w:tcBorders>
                   <w:shd w:val="clear" w:color="auto" w:fill="FFFFFF"/>
                   <w:vAlign w:val="top"/>
+                  <w:tcMar>
+                    <w:top w:w="0" w:type="dxa"/>
+                    <w:bottom w:w="80" w:type="dxa"/>
+                    <w:left w:w="0" w:type="dxa"/>
+                    <w:right w:w="0" w:type="dxa"/>
+                  </w:tcMar>
                 </w:tcPr>
                 <w:p/>
                 <w:tbl>
@@ -924,22 +1321,29 @@
                     <w:tblLook w:firstColumn="1" w:firstRow="1" w:lastColumn="0" w:lastRow="0" w:noHBand="0" w:noVBand="1" w:val="04A0"/>
                   </w:tblPr>
                   <w:tblGrid>
-                    <w:gridCol w:w="3420"/>
+                    <w:gridCol w:w="3456"/>
                   </w:tblGrid>
                   <w:tr>
                     <w:tc>
                       <w:tcPr>
-                        <w:tcW w:type="dxa" w:w="3420"/>
-                        <w:shd w:val="clear" w:color="auto" w:fill="333333"/>
+                        <w:tcW w:type="dxa" w:w="3456"/>
+                        <w:shd w:val="clear" w:color="auto" w:fill="1A1A1A"/>
                         <w:tcBorders>
-                          <w:top w:val="single" w:sz="12" w:space="0" w:color="333333"/>
-                          <w:left w:val="single" w:sz="12" w:space="0" w:color="333333"/>
-                          <w:bottom w:val="single" w:sz="12" w:space="0" w:color="333333"/>
-                          <w:right w:val="single" w:sz="12" w:space="0" w:color="333333"/>
+                          <w:top w:val="single" w:sz="8" w:space="0" w:color="1A1A1A"/>
+                          <w:bottom w:val="single" w:sz="8" w:space="0" w:color="1A1A1A"/>
+                          <w:left w:val="single" w:sz="8" w:space="0" w:color="1A1A1A"/>
+                          <w:right w:val="single" w:sz="8" w:space="0" w:color="1A1A1A"/>
                         </w:tcBorders>
+                        <w:tcMar>
+                          <w:top w:w="60" w:type="dxa"/>
+                          <w:bottom w:w="60" w:type="dxa"/>
+                          <w:left w:w="80" w:type="dxa"/>
+                          <w:right w:w="80" w:type="dxa"/>
+                        </w:tcMar>
                       </w:tcPr>
                       <w:p>
                         <w:pPr>
+                          <w:spacing w:before="0" w:after="0"/>
                           <w:jc w:val="center"/>
                         </w:pPr>
                         <w:r>
@@ -947,7 +1351,7 @@
                             <w:b/>
                             <w:i w:val="0"/>
                             <w:color w:val="FFFFFF"/>
-                            <w:sz w:val="16"/>
+                            <w:sz w:val="18"/>
                             <w:u w:val="none"/>
                           </w:rPr>
                           <w:t>TRAIN STATION TRANSFER</w:t>
@@ -959,29 +1363,62 @@
                 <w:p/>
                 <w:p>
                   <w:pPr>
+                    <w:spacing w:before="0" w:after="0"/>
                     <w:jc w:val="center"/>
                   </w:pPr>
                   <w:r>
                     <w:rPr>
                       <w:b w:val="0"/>
                       <w:i w:val="0"/>
+                      <w:color w:val="000000"/>
                       <w:sz w:val="16"/>
                       <w:u w:val="none"/>
                     </w:rPr>
                     <w:t>From Porto di Ravenna to</w:t>
-                    <w:br/>
+                  </w:r>
+                </w:p>
+                <w:p>
+                  <w:pPr>
+                    <w:spacing w:before="0" w:after="0"/>
+                    <w:jc w:val="center"/>
+                  </w:pPr>
+                  <w:r>
+                    <w:rPr>
+                      <w:b w:val="0"/>
+                      <w:i w:val="0"/>
+                      <w:color w:val="000000"/>
+                      <w:sz w:val="16"/>
+                      <w:u w:val="none"/>
+                    </w:rPr>
                     <w:t>Ravenna Train Station</w:t>
                   </w:r>
                 </w:p>
                 <w:p>
                   <w:pPr>
+                    <w:spacing w:before="0" w:after="0"/>
+                    <w:jc w:val="center"/>
+                  </w:pPr>
+                  <w:r>
+                    <w:rPr>
+                      <w:b w:val="0"/>
+                      <w:i w:val="0"/>
+                      <w:color w:val="000000"/>
+                      <w:sz w:val="10"/>
+                      <w:u w:val="none"/>
+                    </w:rPr>
+                  </w:r>
+                </w:p>
+                <w:p>
+                  <w:pPr>
+                    <w:spacing w:before="0" w:after="0"/>
                     <w:jc w:val="center"/>
                   </w:pPr>
                   <w:r>
                     <w:rPr>
                       <w:b/>
                       <w:i w:val="0"/>
-                      <w:sz w:val="22"/>
+                      <w:color w:val="000000"/>
+                      <w:sz w:val="24"/>
                       <w:u w:val="none"/>
                     </w:rPr>
                     <w:t>for only $23.00/person</w:t>
@@ -989,12 +1426,29 @@
                 </w:p>
                 <w:p>
                   <w:pPr>
+                    <w:spacing w:before="0" w:after="0"/>
                     <w:jc w:val="center"/>
                   </w:pPr>
                   <w:r>
                     <w:rPr>
                       <w:b w:val="0"/>
                       <w:i w:val="0"/>
+                      <w:color w:val="000000"/>
+                      <w:sz w:val="10"/>
+                      <w:u w:val="none"/>
+                    </w:rPr>
+                  </w:r>
+                </w:p>
+                <w:p>
+                  <w:pPr>
+                    <w:spacing w:before="0" w:after="0"/>
+                    <w:jc w:val="center"/>
+                  </w:pPr>
+                  <w:r>
+                    <w:rPr>
+                      <w:b w:val="0"/>
+                      <w:i w:val="0"/>
+                      <w:color w:val="000000"/>
                       <w:sz w:val="16"/>
                       <w:u w:val="none"/>
                     </w:rPr>
@@ -1003,32 +1457,69 @@
                 </w:p>
                 <w:p>
                   <w:pPr>
+                    <w:spacing w:before="0" w:after="0"/>
+                    <w:jc w:val="center"/>
+                  </w:pPr>
+                  <w:r>
+                    <w:rPr>
+                      <w:b w:val="0"/>
+                      <w:i w:val="0"/>
+                      <w:color w:val="000000"/>
+                      <w:sz w:val="10"/>
+                      <w:u w:val="none"/>
+                    </w:rPr>
+                  </w:r>
+                </w:p>
+                <w:p>
+                  <w:pPr>
+                    <w:spacing w:before="0" w:after="0"/>
                     <w:jc w:val="center"/>
                   </w:pPr>
                   <w:r>
                     <w:rPr>
                       <w:b w:val="0"/>
                       <w:i/>
+                      <w:color w:val="000000"/>
                       <w:sz w:val="16"/>
                       <w:u w:val="none"/>
                     </w:rPr>
                     <w:t>Visit Guest Services Desk,</w:t>
-                    <w:br/>
+                  </w:r>
+                </w:p>
+                <w:p>
+                  <w:pPr>
+                    <w:spacing w:before="0" w:after="0"/>
+                    <w:jc w:val="center"/>
+                  </w:pPr>
+                  <w:r>
+                    <w:rPr>
+                      <w:b w:val="0"/>
+                      <w:i/>
+                      <w:color w:val="000000"/>
+                      <w:sz w:val="16"/>
+                      <w:u w:val="none"/>
+                    </w:rPr>
                     <w:t>Deck 7 Mid</w:t>
                   </w:r>
                 </w:p>
               </w:tc>
               <w:tc>
                 <w:tcPr>
-                  <w:tcW w:type="dxa" w:w="3420"/>
+                  <w:tcW w:type="dxa" w:w="3571"/>
                   <w:tcBorders>
-                    <w:top w:val="single" w:sz="12" w:space="0" w:color="000000"/>
-                    <w:left w:val="single" w:sz="12" w:space="0" w:color="000000"/>
-                    <w:bottom w:val="single" w:sz="12" w:space="0" w:color="000000"/>
-                    <w:right w:val="single" w:sz="12" w:space="0" w:color="000000"/>
+                    <w:top w:val="single" w:sz="12" w:space="0" w:color="222222"/>
+                    <w:bottom w:val="single" w:sz="12" w:space="0" w:color="222222"/>
+                    <w:left w:val="single" w:sz="12" w:space="0" w:color="222222"/>
+                    <w:right w:val="single" w:sz="12" w:space="0" w:color="222222"/>
                   </w:tcBorders>
                   <w:shd w:val="clear" w:color="auto" w:fill="FFFFFF"/>
                   <w:vAlign w:val="top"/>
+                  <w:tcMar>
+                    <w:top w:w="0" w:type="dxa"/>
+                    <w:bottom w:w="80" w:type="dxa"/>
+                    <w:left w:w="0" w:type="dxa"/>
+                    <w:right w:w="0" w:type="dxa"/>
+                  </w:tcMar>
                 </w:tcPr>
                 <w:p/>
                 <w:tbl>
@@ -1038,22 +1529,29 @@
                     <w:tblLook w:firstColumn="1" w:firstRow="1" w:lastColumn="0" w:lastRow="0" w:noHBand="0" w:noVBand="1" w:val="04A0"/>
                   </w:tblPr>
                   <w:tblGrid>
-                    <w:gridCol w:w="3420"/>
+                    <w:gridCol w:w="3571"/>
                   </w:tblGrid>
                   <w:tr>
                     <w:tc>
                       <w:tcPr>
-                        <w:tcW w:type="dxa" w:w="3420"/>
-                        <w:shd w:val="clear" w:color="auto" w:fill="333333"/>
+                        <w:tcW w:type="dxa" w:w="3571"/>
+                        <w:shd w:val="clear" w:color="auto" w:fill="1A1A1A"/>
                         <w:tcBorders>
-                          <w:top w:val="single" w:sz="12" w:space="0" w:color="333333"/>
-                          <w:left w:val="single" w:sz="12" w:space="0" w:color="333333"/>
-                          <w:bottom w:val="single" w:sz="12" w:space="0" w:color="333333"/>
-                          <w:right w:val="single" w:sz="12" w:space="0" w:color="333333"/>
+                          <w:top w:val="single" w:sz="8" w:space="0" w:color="1A1A1A"/>
+                          <w:bottom w:val="single" w:sz="8" w:space="0" w:color="1A1A1A"/>
+                          <w:left w:val="single" w:sz="8" w:space="0" w:color="1A1A1A"/>
+                          <w:right w:val="single" w:sz="8" w:space="0" w:color="1A1A1A"/>
                         </w:tcBorders>
+                        <w:tcMar>
+                          <w:top w:w="60" w:type="dxa"/>
+                          <w:bottom w:w="60" w:type="dxa"/>
+                          <w:left w:w="80" w:type="dxa"/>
+                          <w:right w:w="80" w:type="dxa"/>
+                        </w:tcMar>
                       </w:tcPr>
                       <w:p>
                         <w:pPr>
+                          <w:spacing w:before="0" w:after="0"/>
                           <w:jc w:val="center"/>
                         </w:pPr>
                         <w:r>
@@ -1073,47 +1571,125 @@
                 <w:p/>
                 <w:p>
                   <w:pPr>
+                    <w:spacing w:before="0" w:after="0"/>
+                    <w:jc w:val="center"/>
+                  </w:pPr>
+                  <w:r>
+                    <w:rPr>
+                      <w:b w:val="0"/>
+                      <w:i w:val="0"/>
+                      <w:color w:val="000000"/>
+                      <w:sz w:val="10"/>
+                      <w:u w:val="none"/>
+                    </w:rPr>
+                  </w:r>
+                </w:p>
+                <w:p>
+                  <w:pPr>
+                    <w:spacing w:before="0" w:after="0"/>
                     <w:jc w:val="center"/>
                   </w:pPr>
                   <w:r>
                     <w:rPr>
                       <w:b/>
                       <w:i w:val="0"/>
-                      <w:sz w:val="18"/>
+                      <w:color w:val="000000"/>
+                      <w:sz w:val="20"/>
                       <w:u w:val="none"/>
                     </w:rPr>
                     <w:t>Leave the laundry,</w:t>
-                    <w:br/>
+                  </w:r>
+                </w:p>
+                <w:p>
+                  <w:pPr>
+                    <w:spacing w:before="0" w:after="0"/>
+                    <w:jc w:val="center"/>
+                  </w:pPr>
+                  <w:r>
+                    <w:rPr>
+                      <w:b/>
+                      <w:i w:val="0"/>
+                      <w:color w:val="000000"/>
+                      <w:sz w:val="20"/>
+                      <w:u w:val="none"/>
+                    </w:rPr>
                     <w:t>Seize the day!</w:t>
                   </w:r>
                 </w:p>
                 <w:p>
                   <w:pPr>
+                    <w:spacing w:before="0" w:after="0"/>
                     <w:jc w:val="center"/>
                   </w:pPr>
                   <w:r>
                     <w:rPr>
                       <w:b w:val="0"/>
                       <w:i w:val="0"/>
+                      <w:color w:val="000000"/>
                       <w:sz w:val="16"/>
                       <w:u w:val="none"/>
                     </w:rPr>
                     <w:t>Fill the bag–we'll handle</w:t>
-                    <w:br/>
+                  </w:r>
+                </w:p>
+                <w:p>
+                  <w:pPr>
+                    <w:spacing w:before="0" w:after="0"/>
+                    <w:jc w:val="center"/>
+                  </w:pPr>
+                  <w:r>
+                    <w:rPr>
+                      <w:b w:val="0"/>
+                      <w:i w:val="0"/>
+                      <w:color w:val="000000"/>
+                      <w:sz w:val="16"/>
+                      <w:u w:val="none"/>
+                    </w:rPr>
                     <w:t>the rest! Wash &amp; fold in</w:t>
-                    <w:br/>
+                  </w:r>
+                </w:p>
+                <w:p>
+                  <w:pPr>
+                    <w:spacing w:before="0" w:after="0"/>
+                    <w:jc w:val="center"/>
+                  </w:pPr>
+                  <w:r>
+                    <w:rPr>
+                      <w:b w:val="0"/>
+                      <w:i w:val="0"/>
+                      <w:color w:val="000000"/>
+                      <w:sz w:val="16"/>
+                      <w:u w:val="none"/>
+                    </w:rPr>
                     <w:t>48 hours</w:t>
                   </w:r>
                 </w:p>
                 <w:p>
                   <w:pPr>
+                    <w:spacing w:before="0" w:after="0"/>
+                    <w:jc w:val="center"/>
+                  </w:pPr>
+                  <w:r>
+                    <w:rPr>
+                      <w:b w:val="0"/>
+                      <w:i w:val="0"/>
+                      <w:color w:val="000000"/>
+                      <w:sz w:val="10"/>
+                      <w:u w:val="none"/>
+                    </w:rPr>
+                  </w:r>
+                </w:p>
+                <w:p>
+                  <w:pPr>
+                    <w:spacing w:before="0" w:after="0"/>
                     <w:jc w:val="center"/>
                   </w:pPr>
                   <w:r>
                     <w:rPr>
                       <w:b/>
                       <w:i w:val="0"/>
-                      <w:sz w:val="22"/>
+                      <w:color w:val="000000"/>
+                      <w:sz w:val="24"/>
                       <w:u w:val="none"/>
                     </w:rPr>
                     <w:t>for only $39.50</w:t>
@@ -1128,7 +1704,7 @@
     </w:tbl>
     <w:sectPr>
       <w:pgSz w:w="12240" w:h="15840"/>
-      <w:pgMar w:top="680" w:right="680" w:bottom="680" w:left="680" w:header="720" w:footer="720" w:gutter="0"/>
+      <w:pgMar w:top="680" w:right="737" w:bottom="680" w:left="737" w:header="720" w:footer="720" w:gutter="0"/>
       <w:cols w:space="720"/>
       <w:docGrid w:linePitch="360"/>
     </w:sectPr>
@@ -1499,6 +2075,9 @@
     <w:name w:val="Normal"/>
     <w:qFormat/>
     <w:rsid w:val="00FC693F"/>
+    <w:pPr>
+      <w:spacing w:before="0" w:after="0"/>
+    </w:pPr>
   </w:style>
   <w:style w:type="paragraph" w:styleId="Header">
     <w:name w:val="header"/>

</xml_diff>